<commit_message>
Scripts.docx: expand from 20-word stub with real content
Audit finding: manual explained what was removed (XEngine, by the
OpenSimulator project itself, for .NET 6 compatibility) but never what
the current On/Off toggle actually does. Grounded in Forms/FormScripts.vb
(YengineButton/ScriptsOff radio buttons, Settings.ScriptEngine()) and its
tooltips ("Turn scripts off grid-wide"). Notes the per-region override
via Script Overrides (Use Default falls back to this grid-wide setting).
Kept the existing screenshot - still accurate to the current UI.

Co-Authored-By: Claude Sonnet 5 <noreply@anthropic.com>
</commit_message>
<xml_diff>
--- a/Scripts.docx
+++ b/Scripts.docx
@@ -32,6 +32,143 @@
           <w:lang w:val="en"/>
         </w:rPr>
         <w:t>Xengine has been removed by Core.  This is because of Dot Net 6 which is used for portability.</w:t>
+      </w:r>
+    </w:p>
+    <w:p>
+      <w:pPr>
+        <w:rPr>
+          <w:noProof/>
+          <w:lang w:val="en"/>
+        </w:rPr>
+      </w:pPr>
+      <w:r>
+        <w:rPr>
+          <w:noProof/>
+          <w:lang w:val="en"/>
+        </w:rPr>
+        <w:t xml:space="preserve"/>
+      </w:r>
+    </w:p>
+    <w:p>
+      <w:pPr>
+        <w:pStyle w:val="Heading2"/>
+        <w:rPr>
+          <w:noProof/>
+          <w:lang w:val="en"/>
+        </w:rPr>
+      </w:pPr>
+      <w:r>
+        <w:rPr>
+          <w:noProof/>
+          <w:lang w:val="en"/>
+        </w:rPr>
+        <w:t xml:space="preserve">How to open it</w:t>
+      </w:r>
+    </w:p>
+    <w:p>
+      <w:pPr>
+        <w:rPr>
+          <w:noProof/>
+          <w:lang w:val="en"/>
+        </w:rPr>
+      </w:pPr>
+      <w:r>
+        <w:rPr>
+          <w:noProof/>
+          <w:lang w:val="en"/>
+        </w:rPr>
+        <w:t xml:space="preserve">Open the Settings screen, then click Scripts. This sets the grid-wide default - every region uses this unless a region’s own Script Overrides screen picks something different just for it.</w:t>
+      </w:r>
+    </w:p>
+    <w:p>
+      <w:pPr>
+        <w:rPr>
+          <w:noProof/>
+          <w:lang w:val="en"/>
+        </w:rPr>
+      </w:pPr>
+      <w:r>
+        <w:rPr>
+          <w:noProof/>
+          <w:lang w:val="en"/>
+        </w:rPr>
+        <w:t xml:space="preserve"/>
+      </w:r>
+    </w:p>
+    <w:p>
+      <w:pPr>
+        <w:pStyle w:val="Heading2"/>
+        <w:rPr>
+          <w:noProof/>
+          <w:lang w:val="en"/>
+        </w:rPr>
+      </w:pPr>
+      <w:r>
+        <w:rPr>
+          <w:noProof/>
+          <w:lang w:val="en"/>
+        </w:rPr>
+        <w:t xml:space="preserve">Script Engine</w:t>
+      </w:r>
+    </w:p>
+    <w:p>
+      <w:pPr>
+        <w:rPr>
+          <w:noProof/>
+          <w:lang w:val="en"/>
+        </w:rPr>
+      </w:pPr>
+      <w:r>
+        <w:rPr>
+          <w:noProof/>
+          <w:lang w:val="en"/>
+        </w:rPr>
+        <w:t xml:space="preserve">On - turns on the YEngine script engine grid-wide. This is the normal setting for a running grid.</w:t>
+      </w:r>
+    </w:p>
+    <w:p>
+      <w:pPr>
+        <w:rPr>
+          <w:noProof/>
+          <w:lang w:val="en"/>
+        </w:rPr>
+      </w:pPr>
+      <w:r>
+        <w:rPr>
+          <w:noProof/>
+          <w:lang w:val="en"/>
+        </w:rPr>
+        <w:t xml:space="preserve">Off - turns scripts off grid-wide. No LSL (Linden Scripting Language) script runs anywhere on any region until this is switched back on.</w:t>
+      </w:r>
+    </w:p>
+    <w:p>
+      <w:pPr>
+        <w:rPr>
+          <w:noProof/>
+          <w:lang w:val="en"/>
+        </w:rPr>
+      </w:pPr>
+      <w:r>
+        <w:rPr>
+          <w:noProof/>
+          <w:lang w:val="en"/>
+        </w:rPr>
+        <w:t xml:space="preserve"/>
+      </w:r>
+    </w:p>
+    <w:p>
+      <w:pPr>
+        <w:rPr>
+          <w:noProof/>
+          <w:lang w:val="en"/>
+        </w:rPr>
+      </w:pPr>
+      <w:r>
+        <w:rPr>
+          <w:noProof/>
+          <w:lang w:val="en"/>
+        </w:rPr>
+        <w:t xml:space="preserve">Any individual region can override this grid-wide default from that region’s own Script Overrides screen - On, Off, or Use Default (follow whatever is set here) just for that one region.</w:t>
       </w:r>
     </w:p>
     <w:p>

</xml_diff>